<commit_message>
legal(futureproof): upgrade RKN dossier and Privacy Policy to cover all future clubs, platforms, bots and products without re-registration
</commit_message>
<xml_diff>
--- a/baza/исходник миникурса/ПОЛИТИКА_ОБРАБОТКИ_ПЕРСОНАЛЬНЫХ_ДАННЫХ_ФЕДОРОВ.docx
+++ b/baza/исходник миникурса/ПОЛИТИКА_ОБРАБОТКИ_ПЕРСОНАЛЬНЫХ_ДАННЫХ_ФЕДОРОВ.docx
@@ -4,7 +4,6 @@
   <w:body>
     <w:p>
       <w:pPr>
-        <w:spacing w:after="40"/>
         <w:jc w:val="center"/>
       </w:pPr>
       <w:r>
@@ -12,14 +11,15 @@
           <w:rFonts w:ascii="Calibri" w:hAnsi="Calibri"/>
           <w:b/>
           <w:color w:val="1F4E5B"/>
-          <w:sz w:val="32"/>
+          <w:sz w:val="30"/>
         </w:rPr>
         <w:t>ПОЛИТИКА В ОТНОШЕНИИ ОБРАБОТКИ ПЕРСОНАЛЬНЫХ ДАННЫХ</w:t>
+        <w:br/>
+        <w:t>(Универсальная редакция с учетом масштабирования и новых сервисов)</w:t>
       </w:r>
     </w:p>
     <w:p>
       <w:pPr>
-        <w:spacing w:after="280"/>
         <w:jc w:val="center"/>
       </w:pPr>
       <w:r>
@@ -27,7 +27,7 @@
           <w:rFonts w:ascii="Calibri" w:hAnsi="Calibri"/>
           <w:i/>
           <w:color w:val="555555"/>
-          <w:sz w:val="21"/>
+          <w:sz w:val="20"/>
         </w:rPr>
         <w:t>Оператор: Федоров Анатолий Игоревич (ИНН 164803784216, плательщик НПД)</w:t>
         <w:br/>
@@ -57,7 +57,7 @@
           <w:rFonts w:ascii="Calibri" w:hAnsi="Calibri"/>
           <w:sz w:val="20"/>
         </w:rPr>
-        <w:t>1.1. Настоящая Политика в отношении обработки персональных данных (далее — «Политика») составлена в соответствии с требованиями Федерального закона от 27.07.2006 № 152-ФЗ «О персональных данных» и определяет порядок обработки персональных данных и меры по обеспечению их безопасности, предпринимаемые Федоровым Анатолием Игоревичем (ИНН 164803784216), далее — «Оператор».</w:t>
+        <w:t>1.1. Настоящая Политика обработки персональных данных (далее — «Политика») составлена в соответствии с Федеральным законом от 27.07.2006 № 152-ФЗ «О персональных данных» и определяет порядок обработки персональных данных и меры по обеспечению их безопасности, предпринимаемые Федоровым Анатолием Игоревичем (ИНН 164803784216), далее — «Оператор».</w:t>
       </w:r>
     </w:p>
     <w:p>
@@ -69,19 +69,7 @@
           <w:rFonts w:ascii="Calibri" w:hAnsi="Calibri"/>
           <w:sz w:val="20"/>
         </w:rPr>
-        <w:t>1.2. Оператор ставит важнейшей целью и условием осуществления своей деятельности соблюдение прав и свобод человека и гражданина при обработке его персональных данных, в том числе защиты прав на неприкосновенность частной жизни, личную и семейную тайну.</w:t>
-      </w:r>
-    </w:p>
-    <w:p>
-      <w:pPr>
-        <w:spacing w:after="80" w:line="276" w:lineRule="auto"/>
-      </w:pPr>
-      <w:r>
-        <w:rPr>
-          <w:rFonts w:ascii="Calibri" w:hAnsi="Calibri"/>
-          <w:sz w:val="20"/>
-        </w:rPr>
-        <w:t>1.3. Настоящая Политика применяется ко всей информации, которую Оператор может получить о посетителях и пользователях веб-сайтов, веб-приложений (Telegram WebApp / NotiBot), Telegram-ботов (включая https://t.me/psyqst_bot), закрытых каналов и чатов Оператора (далее — «Ресурсы»).</w:t>
+        <w:t>1.2. Политика распространяется на всю информацию, которую Оператор может получить о Пользователях любых его текущих и будущих веб-сайтов, веб-приложений (WebApp/NotiBot), Telegram-ботов (включая @psyqst_bot и сопутствующие боты), закрытых клубов, каналов, платформ онлайн-обучения, мобильных сервисов и вебинарных комнат (далее — «Ресурсы»).</w:t>
       </w:r>
     </w:p>
     <w:p>
@@ -95,7 +83,7 @@
           <w:color w:val="1F4E5B"/>
           <w:sz w:val="24"/>
         </w:rPr>
-        <w:t>2. ОСНОВНЫЕ ПОНЯТИЯ</w:t>
+        <w:t>2. СОСТАВ ОБРАБАТЫВАЕМЫХ ДАННЫХ (С ЗАПАСОМ НА ВСЕ СЕРВИСЫ)</w:t>
       </w:r>
     </w:p>
     <w:p>
@@ -105,17 +93,9 @@
       <w:r>
         <w:rPr>
           <w:rFonts w:ascii="Calibri" w:hAnsi="Calibri"/>
-          <w:b/>
           <w:sz w:val="20"/>
         </w:rPr>
-        <w:t xml:space="preserve">2.1. Персональные данные — </w:t>
-      </w:r>
-      <w:r>
-        <w:rPr>
-          <w:rFonts w:ascii="Calibri" w:hAnsi="Calibri"/>
-          <w:sz w:val="20"/>
-        </w:rPr>
-        <w:t>любая информация, относящаяся прямо или косвенно к определенному или определяемому физическому лицу (субъекту персональных данных).</w:t>
+        <w:t>2.1. Оператор обрабатывает следующие категории данных Пользователей:</w:t>
       </w:r>
     </w:p>
     <w:p>
@@ -125,17 +105,9 @@
       <w:r>
         <w:rPr>
           <w:rFonts w:ascii="Calibri" w:hAnsi="Calibri"/>
-          <w:b/>
           <w:sz w:val="20"/>
         </w:rPr>
-        <w:t xml:space="preserve">2.2. Пользователь — </w:t>
-      </w:r>
-      <w:r>
-        <w:rPr>
-          <w:rFonts w:ascii="Calibri" w:hAnsi="Calibri"/>
-          <w:sz w:val="20"/>
-        </w:rPr>
-        <w:t>любой посетитель и пользователь Ресурсов Оператора, заказчик услуг или участник онлайн-программ.</w:t>
+        <w:t>— Идентификационные данные: фамилия, имя, отчество, никнейм и ID в Telegram/VK/мессенджерах;</w:t>
       </w:r>
     </w:p>
     <w:p>
@@ -145,17 +117,9 @@
       <w:r>
         <w:rPr>
           <w:rFonts w:ascii="Calibri" w:hAnsi="Calibri"/>
-          <w:b/>
           <w:sz w:val="20"/>
         </w:rPr>
-        <w:t xml:space="preserve">2.3. Обработка персональных данных — </w:t>
-      </w:r>
-      <w:r>
-        <w:rPr>
-          <w:rFonts w:ascii="Calibri" w:hAnsi="Calibri"/>
-          <w:sz w:val="20"/>
-        </w:rPr>
-        <w:t>любое действие (операция) или совокупность действий, совершаемых с использованием средств автоматизации или без использования таких средств с персональными данными (сбор, запись, систематизация, накопление, хранение, уточнение, извлечение, использование, передача, обезличивание, блокирование, удаление, уничтожение).</w:t>
+        <w:t>— Контактные данные: номер телефона, адрес электронной почты (e-mail);</w:t>
       </w:r>
     </w:p>
     <w:p>
@@ -165,17 +129,9 @@
       <w:r>
         <w:rPr>
           <w:rFonts w:ascii="Calibri" w:hAnsi="Calibri"/>
-          <w:b/>
           <w:sz w:val="20"/>
         </w:rPr>
-        <w:t xml:space="preserve">2.4. Предоставление персональных данных — </w:t>
-      </w:r>
-      <w:r>
-        <w:rPr>
-          <w:rFonts w:ascii="Calibri" w:hAnsi="Calibri"/>
-          <w:sz w:val="20"/>
-        </w:rPr>
-        <w:t>действия, направленные на раскрытие персональных данных определенному лицу или определенному кругу лиц.</w:t>
+        <w:t>— Платежные сведения: дата, время, сумма платежа, номер заказа, платежная система, статус оплаты (полные реквизиты банковских карт Оператором НЕ хранятся и обрабатываются на стороне сертифицированных платежных шлюзов);</w:t>
       </w:r>
     </w:p>
     <w:p>
@@ -185,17 +141,33 @@
       <w:r>
         <w:rPr>
           <w:rFonts w:ascii="Calibri" w:hAnsi="Calibri"/>
-          <w:b/>
           <w:sz w:val="20"/>
         </w:rPr>
-        <w:t xml:space="preserve">2.5. Обезличивание персональных данных — </w:t>
+        <w:t>— Пользовательский контент: ответы на диагностические тесты, опросники, заполненные тренажеры, домашние задания, текстовые сообщения в чатах поддержки;</w:t>
       </w:r>
+    </w:p>
+    <w:p>
+      <w:pPr>
+        <w:spacing w:after="80" w:line="276" w:lineRule="auto"/>
+      </w:pPr>
       <w:r>
         <w:rPr>
           <w:rFonts w:ascii="Calibri" w:hAnsi="Calibri"/>
           <w:sz w:val="20"/>
         </w:rPr>
-        <w:t>действия, в результате которых становится невозможным без использования дополнительной информации определить принадлежность персональных данных конкретному Пользователю.</w:t>
+        <w:t>— Мультимедиа-данные: аудиозаписи и видеозаписи консультаций, супервизий, вебинаров и групповых мастер-классов (при наличии согласия участников);</w:t>
+      </w:r>
+    </w:p>
+    <w:p>
+      <w:pPr>
+        <w:spacing w:after="80" w:line="276" w:lineRule="auto"/>
+      </w:pPr>
+      <w:r>
+        <w:rPr>
+          <w:rFonts w:ascii="Calibri" w:hAnsi="Calibri"/>
+          <w:sz w:val="20"/>
+        </w:rPr>
+        <w:t>— Технические и аналитические данные: файлы cookie, IP-адрес, тип браузера, тип операционной системы, данные веб-аналитики (Яндекс.Метрика и др.).</w:t>
       </w:r>
     </w:p>
     <w:p>
@@ -209,7 +181,7 @@
           <w:color w:val="1F4E5B"/>
           <w:sz w:val="24"/>
         </w:rPr>
-        <w:t>3. КАТЕГОРИИ ОБРАБАТЫВАЕМЫХ ПЕРСОНАЛЬНЫХ ДАННЫХ</w:t>
+        <w:t>3. ЦЕЛИ ОБРАБОТКИ ДАННЫХ</w:t>
       </w:r>
     </w:p>
     <w:p>
@@ -221,7 +193,7 @@
           <w:rFonts w:ascii="Calibri" w:hAnsi="Calibri"/>
           <w:sz w:val="20"/>
         </w:rPr>
-        <w:t>3.1. Оператор может обрабатывать следующие персональные данные Пользователя:</w:t>
+        <w:t>3.1. Данные обрабатываются для:</w:t>
       </w:r>
     </w:p>
     <w:p>
@@ -233,7 +205,7 @@
           <w:rFonts w:ascii="Calibri" w:hAnsi="Calibri"/>
           <w:sz w:val="20"/>
         </w:rPr>
-        <w:t>— Фамилия, имя, отчество (при наличии);</w:t>
+        <w:t>— Оказания информационно-консультационных, психологических и гипнотерапевтических услуг, проведения индивидуальных и парных сессий;</w:t>
       </w:r>
     </w:p>
     <w:p>
@@ -245,7 +217,7 @@
           <w:rFonts w:ascii="Calibri" w:hAnsi="Calibri"/>
           <w:sz w:val="20"/>
         </w:rPr>
-        <w:t>— Номер контактного телефона;</w:t>
+        <w:t>— Предоставления доступа к онлайн-курсам, практикумам, клубам по подписке, закрытым чатам и Telegram-ботам;</w:t>
       </w:r>
     </w:p>
     <w:p>
@@ -257,7 +229,7 @@
           <w:rFonts w:ascii="Calibri" w:hAnsi="Calibri"/>
           <w:sz w:val="20"/>
         </w:rPr>
-        <w:t>— Адрес электронной почты (e-mail);</w:t>
+        <w:t>— Автоматизированной генерации и отправки диагностических PDF-отчетов и рекомендаций;</w:t>
       </w:r>
     </w:p>
     <w:p>
@@ -269,7 +241,7 @@
           <w:rFonts w:ascii="Calibri" w:hAnsi="Calibri"/>
           <w:sz w:val="20"/>
         </w:rPr>
-        <w:t>— Идентификатор пользователя в мессенджере Telegram (ID и username);</w:t>
+        <w:t>— Приема оплаты и направления фискальных кассовых чеков в соответствии с 54-ФЗ и 422-ФЗ;</w:t>
       </w:r>
     </w:p>
     <w:p>
@@ -281,7 +253,7 @@
           <w:rFonts w:ascii="Calibri" w:hAnsi="Calibri"/>
           <w:sz w:val="20"/>
         </w:rPr>
-        <w:t>— Сведения об оплате услуг (дата, время, сумма платежа, номер заказа/транзакции);</w:t>
+        <w:t>— Клиентской и технической поддержки, ответов на вопросы Пользователей;</w:t>
       </w:r>
     </w:p>
     <w:p>
@@ -293,43 +265,7 @@
           <w:rFonts w:ascii="Calibri" w:hAnsi="Calibri"/>
           <w:sz w:val="20"/>
         </w:rPr>
-        <w:t>— Ответы Пользователя на вопросы психологических тестов, анкет и интерактивных тренажеров;</w:t>
-      </w:r>
-    </w:p>
-    <w:p>
-      <w:pPr>
-        <w:spacing w:after="80" w:line="276" w:lineRule="auto"/>
-      </w:pPr>
-      <w:r>
-        <w:rPr>
-          <w:rFonts w:ascii="Calibri" w:hAnsi="Calibri"/>
-          <w:sz w:val="20"/>
-        </w:rPr>
-        <w:t>— Аудио- и видеозаписи индивидуальных консультаций (при условии согласия сторон);</w:t>
-      </w:r>
-    </w:p>
-    <w:p>
-      <w:pPr>
-        <w:spacing w:after="80" w:line="276" w:lineRule="auto"/>
-      </w:pPr>
-      <w:r>
-        <w:rPr>
-          <w:rFonts w:ascii="Calibri" w:hAnsi="Calibri"/>
-          <w:sz w:val="20"/>
-        </w:rPr>
-        <w:t>— Обезличенные технические данные о посетителях (файлы «cookie», IP-адрес, тип браузера, геолокация) с помощью сервисов интернет-статистики (Яндекс.Метрика и др.).</w:t>
-      </w:r>
-    </w:p>
-    <w:p>
-      <w:pPr>
-        <w:spacing w:after="80" w:line="276" w:lineRule="auto"/>
-      </w:pPr>
-      <w:r>
-        <w:rPr>
-          <w:rFonts w:ascii="Calibri" w:hAnsi="Calibri"/>
-          <w:sz w:val="20"/>
-        </w:rPr>
-        <w:t>3.2. Оператор НЕ обрабатывает специальные категории персональных данных, касающиеся расовой, национальной принадлежности, политических взглядов, религиозных или философских убеждений, интимной жизни, а также биометрические персональные данные.</w:t>
+        <w:t>— Направления сервисных уведомлений, напоминаний об уроках и консультациях, новостных рассылок и спецпредложений (с правом в любой момент отказаться от рассылки в 1 клик).</w:t>
       </w:r>
     </w:p>
     <w:p>
@@ -343,7 +279,7 @@
           <w:color w:val="1F4E5B"/>
           <w:sz w:val="24"/>
         </w:rPr>
-        <w:t>4. ЦЕЛИ ОБРАБОТКИ ПЕРСОНАЛЬНЫХ ДАННЫХ</w:t>
+        <w:t>4. ПРАВОВЫЕ ОСНОВАНИЯ И ПРИНЦИПЫ ОБРАБОТКИ</w:t>
       </w:r>
     </w:p>
     <w:p>
@@ -355,7 +291,7 @@
           <w:rFonts w:ascii="Calibri" w:hAnsi="Calibri"/>
           <w:sz w:val="20"/>
         </w:rPr>
-        <w:t>4.1. Персональные данные Пользователя обрабатываются в следующих целях:</w:t>
+        <w:t>4.1. Обработка осуществляется на основании ст. 6 Федерального закона № 152-ФЗ, ст. 437, 438, 779 ГК РФ, Федерального закона № 422-ФЗ, Публичной оферты и добровольного согласия Пользователя.</w:t>
       </w:r>
     </w:p>
     <w:p>
@@ -367,67 +303,7 @@
           <w:rFonts w:ascii="Calibri" w:hAnsi="Calibri"/>
           <w:sz w:val="20"/>
         </w:rPr>
-        <w:t>— Заключение, исполнение и прекращение договоров возмездного оказания информационно-консультационных услуг, проведения онлайн-курсов и психологических сессий;</w:t>
-      </w:r>
-    </w:p>
-    <w:p>
-      <w:pPr>
-        <w:spacing w:after="80" w:line="276" w:lineRule="auto"/>
-      </w:pPr>
-      <w:r>
-        <w:rPr>
-          <w:rFonts w:ascii="Calibri" w:hAnsi="Calibri"/>
-          <w:sz w:val="20"/>
-        </w:rPr>
-        <w:t>— Предоставление Пользователю доступа к сервисам, материалам, видеоурокам, аудиопрактикам и Telegram-ботам;</w:t>
-      </w:r>
-    </w:p>
-    <w:p>
-      <w:pPr>
-        <w:spacing w:after="80" w:line="276" w:lineRule="auto"/>
-      </w:pPr>
-      <w:r>
-        <w:rPr>
-          <w:rFonts w:ascii="Calibri" w:hAnsi="Calibri"/>
-          <w:sz w:val="20"/>
-        </w:rPr>
-        <w:t>— Формирование и автоматическая отправка персональных аналитических PDF-отчетов по результатам тестирования;</w:t>
-      </w:r>
-    </w:p>
-    <w:p>
-      <w:pPr>
-        <w:spacing w:after="80" w:line="276" w:lineRule="auto"/>
-      </w:pPr>
-      <w:r>
-        <w:rPr>
-          <w:rFonts w:ascii="Calibri" w:hAnsi="Calibri"/>
-          <w:sz w:val="20"/>
-        </w:rPr>
-        <w:t>— Прием и подтверждение оплаты услуг, отправка электронных кассовых чеков в соответствии с 54-ФЗ и 422-ФЗ;</w:t>
-      </w:r>
-    </w:p>
-    <w:p>
-      <w:pPr>
-        <w:spacing w:after="80" w:line="276" w:lineRule="auto"/>
-      </w:pPr>
-      <w:r>
-        <w:rPr>
-          <w:rFonts w:ascii="Calibri" w:hAnsi="Calibri"/>
-          <w:sz w:val="20"/>
-        </w:rPr>
-        <w:t>— Обратная связь с Пользователем, включая направление уведомлений, напоминаний об уроках, ответов на запросы и техническую поддержку;</w:t>
-      </w:r>
-    </w:p>
-    <w:p>
-      <w:pPr>
-        <w:spacing w:after="80" w:line="276" w:lineRule="auto"/>
-      </w:pPr>
-      <w:r>
-        <w:rPr>
-          <w:rFonts w:ascii="Calibri" w:hAnsi="Calibri"/>
-          <w:sz w:val="20"/>
-        </w:rPr>
-        <w:t>— Информирование о новых материалах, продуктах, акциях и вебинарах (с возможностью в любой момент отказаться от рассылки).</w:t>
+        <w:t>4.2. Обработка ограничивается достижением конкретных, заранее определенных целей. Не допускается обработка данных, несовместимая с целями сбора.</w:t>
       </w:r>
     </w:p>
     <w:p>
@@ -441,7 +317,7 @@
           <w:color w:val="1F4E5B"/>
           <w:sz w:val="24"/>
         </w:rPr>
-        <w:t>5. ПРАВОВЫЕ ОСНОВАНИЯ ОБРАБОТКИ ДАННЫХ</w:t>
+        <w:t>5. ЛОКАЛИЗАЦИЯ, ХРАНЕНИЕ И БЕЗОПАСНОСТЬ</w:t>
       </w:r>
     </w:p>
     <w:p>
@@ -453,7 +329,7 @@
           <w:rFonts w:ascii="Calibri" w:hAnsi="Calibri"/>
           <w:sz w:val="20"/>
         </w:rPr>
-        <w:t>5.1. Правовыми основаниями обработки персональных данных Оператором являются:</w:t>
+        <w:t>5.1. Базы данных с персональными данными граждан РФ находятся исключительно на территории Российской Федерации (ч. 5 ст. 18 152-ФЗ).</w:t>
       </w:r>
     </w:p>
     <w:p>
@@ -465,7 +341,7 @@
           <w:rFonts w:ascii="Calibri" w:hAnsi="Calibri"/>
           <w:sz w:val="20"/>
         </w:rPr>
-        <w:t>— Конституция Российской Федерации;</w:t>
+        <w:t>5.2. Оператор применяет организационные и технические меры безопасности: SSL/TLS шифрование, ограничение доступа, парольная защита, резервное копирование.</w:t>
       </w:r>
     </w:p>
     <w:p>
@@ -477,55 +353,7 @@
           <w:rFonts w:ascii="Calibri" w:hAnsi="Calibri"/>
           <w:sz w:val="20"/>
         </w:rPr>
-        <w:t>— Гражданский кодекс Российской Федерации (ст. 437, 438, 779 ГК РФ);</w:t>
-      </w:r>
-    </w:p>
-    <w:p>
-      <w:pPr>
-        <w:spacing w:after="80" w:line="276" w:lineRule="auto"/>
-      </w:pPr>
-      <w:r>
-        <w:rPr>
-          <w:rFonts w:ascii="Calibri" w:hAnsi="Calibri"/>
-          <w:sz w:val="20"/>
-        </w:rPr>
-        <w:t>— Федеральный закон от 27.07.2006 № 152-ФЗ «О персональных данных» (п. 1 и п. 5 ч. 1 ст. 6);</w:t>
-      </w:r>
-    </w:p>
-    <w:p>
-      <w:pPr>
-        <w:spacing w:after="80" w:line="276" w:lineRule="auto"/>
-      </w:pPr>
-      <w:r>
-        <w:rPr>
-          <w:rFonts w:ascii="Calibri" w:hAnsi="Calibri"/>
-          <w:sz w:val="20"/>
-        </w:rPr>
-        <w:t>— Федеральный закон от 27.11.2018 № 422-ФЗ «О проведении эксперимента по установлению специального налогового режима «Налог на профессиональный доход»;</w:t>
-      </w:r>
-    </w:p>
-    <w:p>
-      <w:pPr>
-        <w:spacing w:after="80" w:line="276" w:lineRule="auto"/>
-      </w:pPr>
-      <w:r>
-        <w:rPr>
-          <w:rFonts w:ascii="Calibri" w:hAnsi="Calibri"/>
-          <w:sz w:val="20"/>
-        </w:rPr>
-        <w:t>— Публичная оферта и договоры, заключаемые между Оператором и Пользователем;</w:t>
-      </w:r>
-    </w:p>
-    <w:p>
-      <w:pPr>
-        <w:spacing w:after="80" w:line="276" w:lineRule="auto"/>
-      </w:pPr>
-      <w:r>
-        <w:rPr>
-          <w:rFonts w:ascii="Calibri" w:hAnsi="Calibri"/>
-          <w:sz w:val="20"/>
-        </w:rPr>
-        <w:t>— Согласие Пользователя на обработку персональных данных.</w:t>
+        <w:t>5.3. Передача данных третьим лицам запрещена, за исключением банков и платежных систем (Robokassa и др.) и телеком-провайдеров исключительно в объеме, необходимом для исполнения договора.</w:t>
       </w:r>
     </w:p>
     <w:p>
@@ -539,7 +367,7 @@
           <w:color w:val="1F4E5B"/>
           <w:sz w:val="24"/>
         </w:rPr>
-        <w:t>6. ПОРЯДОК СБОРА, ХРАНЕНИЯ И ПЕРЕДАЧИ ДАННЫХ</w:t>
+        <w:t>6. ПРАВА ПОЛЬЗОВАТЕЛЯ И ОТЗЫВ СОГЛАСИЯ</w:t>
       </w:r>
     </w:p>
     <w:p>
@@ -551,7 +379,7 @@
           <w:rFonts w:ascii="Calibri" w:hAnsi="Calibri"/>
           <w:sz w:val="20"/>
         </w:rPr>
-        <w:t>6.1. Безопасность персональных данных обеспечивается путем реализации правовых, организационных и технических мер, необходимых для выполнения в полном объеме требований законодательства в области защиты ПД.</w:t>
+        <w:t>6.1. Пользователь вправе запросить информацию о своих данных, требовать их изменения или удаления.</w:t>
       </w:r>
     </w:p>
     <w:p>
@@ -563,43 +391,7 @@
           <w:rFonts w:ascii="Calibri" w:hAnsi="Calibri"/>
           <w:sz w:val="20"/>
         </w:rPr>
-        <w:t>6.2. Оператор обеспечивает сохранность персональных данных и принимает все возможные меры, исключающие доступ к ним неуполномоченных лиц.</w:t>
-      </w:r>
-    </w:p>
-    <w:p>
-      <w:pPr>
-        <w:spacing w:after="80" w:line="276" w:lineRule="auto"/>
-      </w:pPr>
-      <w:r>
-        <w:rPr>
-          <w:rFonts w:ascii="Calibri" w:hAnsi="Calibri"/>
-          <w:sz w:val="20"/>
-        </w:rPr>
-        <w:t>6.3. Персональные данные Пользователя никогда, ни при каких условиях не будут переданы третьим лицам, за исключением случаев, связанных с исполнением действующего законодательства либо передачей данных уполномоченным платежным сервисам (Robokassa и др.) и телекоммуникационным платформам исключительно в объеме, необходимом для проведения расчетов и доставки сообщений.</w:t>
-      </w:r>
-    </w:p>
-    <w:p>
-      <w:pPr>
-        <w:spacing w:after="80" w:line="276" w:lineRule="auto"/>
-      </w:pPr>
-      <w:r>
-        <w:rPr>
-          <w:rFonts w:ascii="Calibri" w:hAnsi="Calibri"/>
-          <w:sz w:val="20"/>
-        </w:rPr>
-        <w:t>6.4. Базы данных информации граждан РФ размещены строго на территории Российской Федерации в соответствии с требованием ч. 5 ст. 18 152-ФЗ.</w:t>
-      </w:r>
-    </w:p>
-    <w:p>
-      <w:pPr>
-        <w:spacing w:after="80" w:line="276" w:lineRule="auto"/>
-      </w:pPr>
-      <w:r>
-        <w:rPr>
-          <w:rFonts w:ascii="Calibri" w:hAnsi="Calibri"/>
-          <w:sz w:val="20"/>
-        </w:rPr>
-        <w:t>6.5. Срок обработки персональных данных является неограниченным до достижения целей обработки, либо до момента отзыва согласия Пользователем.</w:t>
+        <w:t>6.2. Отзыв согласия осуществляется направлением письма на e-mail: tolikus@inbox.ru с темой «Отзыв согласия на обработку персональных данных». Срок удаления данных — до 30 дней, если иное не предусмотрено законодательством РФ.</w:t>
       </w:r>
     </w:p>
     <w:p>
@@ -613,7 +405,7 @@
           <w:color w:val="1F4E5B"/>
           <w:sz w:val="24"/>
         </w:rPr>
-        <w:t>7. ПРАВА ПОЛЬЗОВАТЕЛЯ И ПОРЯДОК ОТЗЫВА СОГЛАСИЯ</w:t>
+        <w:t>7. РЕКВИЗИТЫ ОПЕРАТОРА</w:t>
       </w:r>
     </w:p>
     <w:p>
@@ -625,109 +417,7 @@
           <w:rFonts w:ascii="Calibri" w:hAnsi="Calibri"/>
           <w:sz w:val="20"/>
         </w:rPr>
-        <w:t>7.1. Пользователь имеет право на получение информации, касающейся обработки его персональных данных, требовать их уточнения, блокирования или уничтожения в случае, если данные являются неполными, устаревшими или неточными.</w:t>
-      </w:r>
-    </w:p>
-    <w:p>
-      <w:pPr>
-        <w:spacing w:after="80" w:line="276" w:lineRule="auto"/>
-      </w:pPr>
-      <w:r>
-        <w:rPr>
-          <w:rFonts w:ascii="Calibri" w:hAnsi="Calibri"/>
-          <w:sz w:val="20"/>
-        </w:rPr>
-        <w:t>7.2. Пользователь может в любой момент отозвать свое согласие на обработку персональных данных, направив Оператору уведомление посредством электронной почты на адрес: tolikus@inbox.ru с пометкой «Отзыв согласия на обработку персональных данных».</w:t>
-      </w:r>
-    </w:p>
-    <w:p>
-      <w:pPr>
-        <w:spacing w:after="80" w:line="276" w:lineRule="auto"/>
-      </w:pPr>
-      <w:r>
-        <w:rPr>
-          <w:rFonts w:ascii="Calibri" w:hAnsi="Calibri"/>
-          <w:sz w:val="20"/>
-        </w:rPr>
-        <w:t>7.3. Пользователь может в любой момент отказаться от получения информационных рассылок, нажав кнопку отписки в боте либо направив письмо на e-mail: tolikus@inbox.ru.</w:t>
-      </w:r>
-    </w:p>
-    <w:p>
-      <w:pPr>
-        <w:spacing w:before="220" w:after="60"/>
-      </w:pPr>
-      <w:r>
-        <w:rPr>
-          <w:rFonts w:ascii="Calibri" w:hAnsi="Calibri"/>
-          <w:b/>
-          <w:color w:val="1F4E5B"/>
-          <w:sz w:val="24"/>
-        </w:rPr>
-        <w:t>8. ЗАКЛЮЧИТЕЛЬНЫЕ ПОЛОЖЕНИЯ</w:t>
-      </w:r>
-    </w:p>
-    <w:p>
-      <w:pPr>
-        <w:spacing w:after="80" w:line="276" w:lineRule="auto"/>
-      </w:pPr>
-      <w:r>
-        <w:rPr>
-          <w:rFonts w:ascii="Calibri" w:hAnsi="Calibri"/>
-          <w:sz w:val="20"/>
-        </w:rPr>
-        <w:t>8.1. Пользователь может получить любые разъяснения по интересующим вопросам, касающимся обработки его персональных данных, обратившись к Оператору по электронной почте: tolikus@inbox.ru.</w:t>
-      </w:r>
-    </w:p>
-    <w:p>
-      <w:pPr>
-        <w:spacing w:after="80" w:line="276" w:lineRule="auto"/>
-      </w:pPr>
-      <w:r>
-        <w:rPr>
-          <w:rFonts w:ascii="Calibri" w:hAnsi="Calibri"/>
-          <w:sz w:val="20"/>
-        </w:rPr>
-        <w:t>8.2. В данном документе будут отражены любые изменения политики обработки персональных данных Оператором. Политика действует бессрочно до замены ее новой версией.</w:t>
-      </w:r>
-    </w:p>
-    <w:p>
-      <w:pPr>
-        <w:spacing w:after="80" w:line="276" w:lineRule="auto"/>
-      </w:pPr>
-      <w:r>
-        <w:rPr>
-          <w:rFonts w:ascii="Calibri" w:hAnsi="Calibri"/>
-          <w:sz w:val="20"/>
-        </w:rPr>
-        <w:t>8.3. Актуальная версия Политики в свободном доступе расположена в сети Интернет на Ресурсах Оператора.</w:t>
-      </w:r>
-    </w:p>
-    <w:p>
-      <w:pPr>
-        <w:spacing w:before="220" w:after="60"/>
-      </w:pPr>
-      <w:r>
-        <w:rPr>
-          <w:rFonts w:ascii="Calibri" w:hAnsi="Calibri"/>
-          <w:b/>
-          <w:color w:val="1F4E5B"/>
-          <w:sz w:val="24"/>
-        </w:rPr>
-        <w:t>9. РЕКВИЗИТЫ ОПЕРАТОРА</w:t>
-      </w:r>
-    </w:p>
-    <w:p>
-      <w:pPr>
-        <w:spacing w:after="80" w:line="276" w:lineRule="auto"/>
-      </w:pPr>
-      <w:r>
-        <w:rPr>
-          <w:rFonts w:ascii="Calibri" w:hAnsi="Calibri"/>
-          <w:sz w:val="20"/>
-        </w:rPr>
-        <w:t>Оператор: Федоров Анатолий Игоревич (плательщик налога на профессиональный доход)</w:t>
-        <w:br/>
-        <w:t>ИНН: 164803784216</w:t>
+        <w:t>Оператор: Федоров Анатолий Игоревич (ИНН 164803784216)</w:t>
         <w:br/>
         <w:t>E-mail: tolikus@inbox.ru</w:t>
         <w:br/>

</xml_diff>